<commit_message>
docs: atualiza roteiros do professor para backup e novo clone
</commit_message>
<xml_diff>
--- a/professor/Roteiro_Professor_Passos_Alunos_Aula_1.docx
+++ b/professor/Roteiro_Professor_Passos_Alunos_Aula_1.docx
@@ -7,7 +7,7 @@
         <w:pStyle w:val="Title"/>
       </w:pPr>
       <w:r>
-        <w:t>Passos para orientar os alunos</w:t>
+        <w:t>Passos do professor para orientar os alunos</w:t>
       </w:r>
     </w:p>
     <w:p>
@@ -15,12 +15,12 @@
         <w:pStyle w:val="Subtitle"/>
       </w:pPr>
       <w:r>
-        <w:t>Roteiro do professor para a aula 1 da Jornada B3</w:t>
+        <w:t>Roteiro para a aula 1 da Jornada B3</w:t>
       </w:r>
     </w:p>
     <w:p>
       <w:r>
-        <w:t>Use esta lista para orientar a turma. Peça que os alunos preparem o computador antes da aula, com internet e tempo para os downloads. O preparo automático termina com a mensagem PRONTO.</w:t>
+        <w:t>O histórico do Git foi revisado. Oriente a turma a baixar o ZIP novo e fazer um novo clone antes da aula, com internet e tempo para os downloads. Quem ainda não tinha o projeto começa no passo 2.</w:t>
       </w:r>
     </w:p>
     <w:p>
@@ -28,36 +28,73 @@
         <w:pStyle w:val="Heading2"/>
       </w:pPr>
       <w:r>
-        <w:t>1 Compartilhe o material</w:t>
+        <w:t>1 Oriente o backup e guarde a cópia antiga</w:t>
       </w:r>
     </w:p>
     <w:p>
       <w:r>
-        <w:t>Envie aos alunos o link abaixo. Basta baixar esse ZIP; os scripts, o projeto e os guias já estão juntos.</w:t>
+        <w:t>Peça que copiem os exercícios para uma pasta de backup fora do projeto antigo. Se já executaram o laboratório, no terminal do projeto antigo, encerrem os containers preservando os dados:</w:t>
       </w:r>
     </w:p>
     <w:p>
+      <w:pPr>
+        <w:keepLines/>
+        <w:spacing w:before="20" w:after="120"/>
+        <w:ind w:left="170"/>
+      </w:pPr>
+      <w:r>
+        <w:rPr>
+          <w:rFonts w:ascii="Courier New" w:hAnsi="Courier New"/>
+          <w:sz w:val="18"/>
+        </w:rPr>
+        <w:t>podman compose --profile contratos down</w:t>
+      </w:r>
+    </w:p>
+    <w:p>
+      <w:r>
+        <w:t xml:space="preserve">Depois, fechem a IDE e renomeiem a pasta antiga para um nome disponível, como </w:t>
+      </w:r>
+      <w:r>
+        <w:rPr>
+          <w:b/>
+        </w:rPr>
+        <w:t>laboratorios-eda-antigo</w:t>
+      </w:r>
+      <w:r>
+        <w:t xml:space="preserve">. Não apaguem essa cópia. </w:t>
+      </w:r>
+      <w:r>
+        <w:rPr>
+          <w:b/>
+        </w:rPr>
+        <w:t>Não usem git pull nem mesclem o histórico antigo.</w:t>
+      </w:r>
+      <w:r/>
+    </w:p>
+    <w:p>
+      <w:pPr>
+        <w:pStyle w:val="Heading2"/>
+      </w:pPr>
+      <w:r>
+        <w:t>2 Compartilhe o ZIP novo</w:t>
+      </w:r>
+    </w:p>
+    <w:p>
+      <w:r/>
       <w:hyperlink r:id="rId9">
         <w:r>
           <w:rPr>
             <w:color w:val="0563C1"/>
             <w:u w:val="single"/>
           </w:rPr>
-          <w:t>Baixar o ZIP completo das aulas</w:t>
+          <w:t>Baixar o ZIP atualizado das aulas</w:t>
         </w:r>
       </w:hyperlink>
-    </w:p>
-    <w:p>
-      <w:pPr>
-        <w:pStyle w:val="Heading2"/>
-      </w:pPr>
-      <w:r>
-        <w:t>2 Peça que extraiam o ZIP</w:t>
-      </w:r>
+      <w:r/>
     </w:p>
     <w:p>
       <w:r>
-        <w:t xml:space="preserve">Oriente a turma a abrir a pasta </w:t>
+        <w:t xml:space="preserve">Peça que extraiam o ZIP em uma pasta nova, abram </w:t>
       </w:r>
       <w:r>
         <w:rPr>
@@ -66,7 +103,7 @@
         <w:t>Entrega_EDA_Alunos</w:t>
       </w:r>
       <w:r>
-        <w:t xml:space="preserve"> já extraída e manter todos os arquivos juntos. A mensagem curta para os alunos está em </w:t>
+        <w:t xml:space="preserve"> e mantenham todos os arquivos juntos. A mensagem para enviar à turma é </w:t>
       </w:r>
       <w:r>
         <w:rPr>
@@ -75,7 +112,7 @@
         <w:t>Mensagem_Alunos_Preparacao_Aula_1.docx</w:t>
       </w:r>
       <w:r>
-        <w:t>, dentro dessa pasta.</w:t>
+        <w:t>, dentro do ZIP.</w:t>
       </w:r>
     </w:p>
     <w:p>
@@ -83,7 +120,21 @@
         <w:pStyle w:val="Heading2"/>
       </w:pPr>
       <w:r>
-        <w:t>3 Oriente cada aluno pelo sistema que usa</w:t>
+        <w:t>3 Oriente o preparador para fazer um novo clone</w:t>
+      </w:r>
+    </w:p>
+    <w:p>
+      <w:r>
+        <w:t xml:space="preserve">O destino padrão </w:t>
+      </w:r>
+      <w:r>
+        <w:rPr>
+          <w:b/>
+        </w:rPr>
+        <w:t>JornadaB3/laboratorios-eda</w:t>
+      </w:r>
+      <w:r>
+        <w:t>, dentro da pasta pessoal, precisa estar livre após renomear a cópia antiga.</w:t>
       </w:r>
     </w:p>
     <w:p>
@@ -191,12 +242,12 @@
         <w:pStyle w:val="Heading2"/>
       </w:pPr>
       <w:r>
-        <w:t>4 Acompanhe as solicitações de instalação</w:t>
+        <w:t>4 Acompanhe as permissões e o reinício</w:t>
       </w:r>
     </w:p>
     <w:p>
       <w:r>
-        <w:t xml:space="preserve">Peça que leiam e confirmem as permissões. Se o Windows solicitar administrador, o aluno deve reabrir o PowerShell como administrador na mesma pasta e repetir o comando. Se aparecer </w:t>
+        <w:t xml:space="preserve">Se o Windows pedir administrador, reabra o PowerShell como administrador na mesma pasta e repita o comando. Se aparecer </w:t>
       </w:r>
       <w:r>
         <w:rPr>
@@ -205,7 +256,7 @@
         <w:t>REINICIO NECESSARIO</w:t>
       </w:r>
       <w:r>
-        <w:t>, deve reiniciar o computador e executar o mesmo comando novamente. Bloqueios corporativos devem ser tratados com a TI.</w:t>
+        <w:t>, reinicie o computador e repita o comando. Bloqueios corporativos devem ser tratados com a TI.</w:t>
       </w:r>
     </w:p>
     <w:p>
@@ -213,12 +264,12 @@
         <w:pStyle w:val="Heading2"/>
       </w:pPr>
       <w:r>
-        <w:t>5 Confirme quem está pronto</w:t>
+        <w:t>5 Confirme PRONTO e a retomada dos exercícios</w:t>
       </w:r>
     </w:p>
     <w:p>
       <w:r>
-        <w:t xml:space="preserve">Peça a cada aluno que confirme se apareceu </w:t>
+        <w:t xml:space="preserve">Peça a confirmação de </w:t>
       </w:r>
       <w:r>
         <w:rPr>
@@ -227,7 +278,16 @@
         <w:t>PRONTO</w:t>
       </w:r>
       <w:r>
-        <w:t>. Essa mensagem indica que o projeto foi preparado e o teste HTTP da aula 1 passou. Em caso de erro, peça a mensagem completa ou uma captura da tela para atendimento antes da aula.</w:t>
+        <w:t xml:space="preserve"> e que abram na IDE o projeto novo indicado ao final. O teste HTTP da aula 1 já terá passado. Retomem somente os arquivos dos exercícios necessários, sem copiar </w:t>
+      </w:r>
+      <w:r>
+        <w:rPr>
+          <w:b/>
+        </w:rPr>
+        <w:t>.git</w:t>
+      </w:r>
+      <w:r>
+        <w:t xml:space="preserve"> nem substituir o projeto inteiro. Mantenham o backup até conferir tudo. Em caso de erro, peça a mensagem completa ou uma captura da tela antes da aula.</w:t>
       </w:r>
     </w:p>
     <w:p>
@@ -235,12 +295,12 @@
         <w:pStyle w:val="Heading2"/>
       </w:pPr>
       <w:r>
-        <w:t>6 Comece a aula pelo projeto preparado</w:t>
+        <w:t>6 Comece a aula e encerre preservando os dados</w:t>
       </w:r>
     </w:p>
     <w:p>
       <w:r>
-        <w:t xml:space="preserve">Oriente os alunos a abrir na IDE a pasta indicada ao final do preparo e seguir </w:t>
+        <w:t xml:space="preserve">No projeto novo, siga </w:t>
       </w:r>
       <w:r>
         <w:rPr>
@@ -249,7 +309,7 @@
         <w:t>docs/AULA-1.md</w:t>
       </w:r>
       <w:r>
-        <w:t xml:space="preserve"> dentro do projeto. Não precisam clonar novamente nem repetir a configuração manual. Ao encerrar, execute no terminal da pasta do projeto:</w:t>
+        <w:t>. O preparador já fez o novo clone; não é necessário repetir a instalação manual. Ao encerrar, no terminal da pasta do projeto, execute:</w:t>
       </w:r>
     </w:p>
     <w:p>
@@ -264,11 +324,6 @@
           <w:sz w:val="18"/>
         </w:rPr>
         <w:t>podman compose down</w:t>
-      </w:r>
-    </w:p>
-    <w:p>
-      <w:r>
-        <w:t>Esse encerramento preserva os dados do laboratório.</w:t>
       </w:r>
     </w:p>
     <w:sectPr>

</xml_diff>

<commit_message>
docs: orienta professor nas duas aulas Maven e quatro camadas
</commit_message>
<xml_diff>
--- a/professor/Roteiro_Professor_Passos_Alunos_Aula_1.docx
+++ b/professor/Roteiro_Professor_Passos_Alunos_Aula_1.docx
@@ -7,7 +7,7 @@
         <w:pStyle w:val="Title"/>
       </w:pPr>
       <w:r>
-        <w:t>Passos do professor para orientar os alunos</w:t>
+        <w:t>Roteiro do professor para as duas aulas com Maven</w:t>
       </w:r>
     </w:p>
     <w:p>
@@ -15,12 +15,42 @@
         <w:pStyle w:val="Subtitle"/>
       </w:pPr>
       <w:r>
-        <w:t>Roteiro para a aula 1 da Jornada B3</w:t>
+        <w:t>Jornada B3 de Arquitetura Orientada a Eventos</w:t>
       </w:r>
     </w:p>
     <w:p>
       <w:r>
-        <w:t>O histórico do Git foi revisado. Oriente a turma a baixar o ZIP novo e fazer um novo clone antes da aula, com internet e tempo para os downloads. Quem ainda não tinha o projeto começa no passo 2.</w:t>
+        <w:t xml:space="preserve">Conduza as aulas com Java 25, Maven e Clean Architecture em quatro camadas. Consulte este roteiro na branch </w:t>
+      </w:r>
+      <w:r>
+        <w:rPr>
+          <w:rFonts w:ascii="Courier New" w:hAnsi="Courier New"/>
+          <w:sz w:val="19"/>
+        </w:rPr>
+        <w:t>professor</w:t>
+      </w:r>
+      <w:r>
+        <w:t xml:space="preserve"> e execute os comandos em outra cópia do laboratório, clonada do bundle atualizado, nas branches </w:t>
+      </w:r>
+      <w:r>
+        <w:rPr>
+          <w:rFonts w:ascii="Courier New" w:hAnsi="Courier New"/>
+          <w:sz w:val="19"/>
+        </w:rPr>
+        <w:t>aula-1</w:t>
+      </w:r>
+      <w:r>
+        <w:t xml:space="preserve"> e </w:t>
+      </w:r>
+      <w:r>
+        <w:rPr>
+          <w:rFonts w:ascii="Courier New" w:hAnsi="Courier New"/>
+          <w:sz w:val="19"/>
+        </w:rPr>
+        <w:t>aula-2</w:t>
+      </w:r>
+      <w:r>
+        <w:t>. Faça o primeiro download e build antes do encontro.</w:t>
       </w:r>
     </w:p>
     <w:p>
@@ -28,55 +58,42 @@
         <w:pStyle w:val="Heading2"/>
       </w:pPr>
       <w:r>
-        <w:t>1 Oriente o backup e guarde a cópia antiga</w:t>
+        <w:t>Preparação da turma e do professor</w:t>
       </w:r>
     </w:p>
     <w:p>
       <w:r>
-        <w:t>Peça que copiem os exercícios para uma pasta de backup fora do projeto antigo. Se já executaram o laboratório, no terminal do projeto antigo, encerrem os containers preservando os dados:</w:t>
-      </w:r>
-    </w:p>
-    <w:p>
-      <w:pPr>
-        <w:keepLines/>
-        <w:spacing w:before="20" w:after="120"/>
-        <w:ind w:left="170"/>
-      </w:pPr>
+        <w:t xml:space="preserve">Quem já tinha o projeto deve salvar os exercícios fora da pasta antiga, encerrar seus containers com </w:t>
+      </w:r>
       <w:r>
         <w:rPr>
           <w:rFonts w:ascii="Courier New" w:hAnsi="Courier New"/>
-          <w:sz w:val="18"/>
+          <w:sz w:val="19"/>
         </w:rPr>
         <w:t>podman compose --profile contratos down</w:t>
       </w:r>
-    </w:p>
-    <w:p>
-      <w:r>
-        <w:t xml:space="preserve">Depois, fechem a IDE e renomeiem a pasta antiga para um nome disponível, como </w:t>
+      <w:r>
+        <w:t xml:space="preserve"> e renomear a pasta antiga. Baixe o ZIP novo, extraia em uma pasta nova e faça um novo clone. Retome apenas os arquivos dos exercícios necessários, sem copiar </w:t>
       </w:r>
       <w:r>
         <w:rPr>
-          <w:b/>
+          <w:rFonts w:ascii="Courier New" w:hAnsi="Courier New"/>
+          <w:sz w:val="19"/>
         </w:rPr>
-        <w:t>laboratorios-eda-antigo</w:t>
-      </w:r>
-      <w:r>
-        <w:t xml:space="preserve">. Não apaguem essa cópia. </w:t>
+        <w:t>.git</w:t>
+      </w:r>
+      <w:r>
+        <w:t xml:space="preserve">, usar </w:t>
       </w:r>
       <w:r>
         <w:rPr>
-          <w:b/>
+          <w:rFonts w:ascii="Courier New" w:hAnsi="Courier New"/>
+          <w:sz w:val="19"/>
         </w:rPr>
-        <w:t>Não usem git pull nem mesclem o histórico antigo.</w:t>
-      </w:r>
-      <w:r/>
-    </w:p>
-    <w:p>
-      <w:pPr>
-        <w:pStyle w:val="Heading2"/>
-      </w:pPr>
-      <w:r>
-        <w:t>2 Compartilhe o ZIP novo</w:t>
+        <w:t>git pull</w:t>
+      </w:r>
+      <w:r>
+        <w:t xml:space="preserve"> na cópia antiga ou mesclar o histórico anterior.</w:t>
       </w:r>
     </w:p>
     <w:p>
@@ -94,78 +111,48 @@
     </w:p>
     <w:p>
       <w:r>
-        <w:t xml:space="preserve">Peça que extraiam o ZIP em uma pasta nova, abram </w:t>
-      </w:r>
+        <w:t xml:space="preserve">A mensagem para repassar à turma é </w:t>
+      </w:r>
+      <w:r>
+        <w:rPr>
+          <w:rFonts w:ascii="Courier New" w:hAnsi="Courier New"/>
+          <w:sz w:val="19"/>
+        </w:rPr>
+        <w:t>Mensagem_Alunos_Preparacao_Aula_1.docx</w:t>
+      </w:r>
+      <w:r>
+        <w:t xml:space="preserve">, dentro do ZIP. Na pasta extraída </w:t>
+      </w:r>
+      <w:r>
+        <w:rPr>
+          <w:rFonts w:ascii="Courier New" w:hAnsi="Courier New"/>
+          <w:sz w:val="19"/>
+        </w:rPr>
+        <w:t>Entrega_EDA_Alunos</w:t>
+      </w:r>
+      <w:r>
+        <w:t xml:space="preserve">, o preparador faz o clone e verifica a aula 1. Deixe livre o destino </w:t>
+      </w:r>
+      <w:r>
+        <w:rPr>
+          <w:rFonts w:ascii="Courier New" w:hAnsi="Courier New"/>
+          <w:sz w:val="19"/>
+        </w:rPr>
+        <w:t>JornadaB3/laboratorios-eda</w:t>
+      </w:r>
+      <w:r>
+        <w:t xml:space="preserve"> na pasta pessoal.</w:t>
+      </w:r>
+    </w:p>
+    <w:p>
+      <w:r/>
       <w:r>
         <w:rPr>
           <w:b/>
         </w:rPr>
-        <w:t>Entrega_EDA_Alunos</w:t>
-      </w:r>
-      <w:r>
-        <w:t xml:space="preserve"> e mantenham todos os arquivos juntos. A mensagem para enviar à turma é </w:t>
-      </w:r>
-      <w:r>
-        <w:rPr>
-          <w:b/>
-        </w:rPr>
-        <w:t>Mensagem_Alunos_Preparacao_Aula_1.docx</w:t>
-      </w:r>
-      <w:r>
-        <w:t>, dentro do ZIP.</w:t>
-      </w:r>
-    </w:p>
-    <w:p>
-      <w:pPr>
-        <w:pStyle w:val="Heading2"/>
-      </w:pPr>
-      <w:r>
-        <w:t>3 Oriente o preparador para fazer um novo clone</w:t>
-      </w:r>
-    </w:p>
-    <w:p>
-      <w:r>
-        <w:t xml:space="preserve">O destino padrão </w:t>
-      </w:r>
-      <w:r>
-        <w:rPr>
-          <w:b/>
-        </w:rPr>
-        <w:t>JornadaB3/laboratorios-eda</w:t>
-      </w:r>
-      <w:r>
-        <w:t>, dentro da pasta pessoal, precisa estar livre após renomear a cópia antiga.</w:t>
-      </w:r>
-    </w:p>
-    <w:p>
+        <w:t>Windows no PowerShell:</w:t>
+      </w:r>
       <w:r/>
-      <w:r>
-        <w:rPr>
-          <w:b/>
-        </w:rPr>
-        <w:t>Windows:</w:t>
-      </w:r>
-      <w:r>
-        <w:t xml:space="preserve"> na pasta </w:t>
-      </w:r>
-      <w:r>
-        <w:rPr>
-          <w:b/>
-        </w:rPr>
-        <w:t>Entrega_EDA_Alunos</w:t>
-      </w:r>
-      <w:r>
-        <w:t xml:space="preserve">, clique na barra de endereço do Explorador, digite </w:t>
-      </w:r>
-      <w:r>
-        <w:rPr>
-          <w:b/>
-        </w:rPr>
-        <w:t>powershell</w:t>
-      </w:r>
-      <w:r>
-        <w:t xml:space="preserve"> e pressione Enter. Cole as duas linhas juntas e execute:</w:t>
-      </w:r>
     </w:p>
     <w:p>
       <w:pPr>
@@ -189,39 +176,9 @@
         <w:rPr>
           <w:b/>
         </w:rPr>
-        <w:t>Mac:</w:t>
-      </w:r>
-      <w:r>
-        <w:t xml:space="preserve"> abra o </w:t>
-      </w:r>
-      <w:r>
-        <w:rPr>
-          <w:b/>
-        </w:rPr>
-        <w:t>Terminal</w:t>
-      </w:r>
-      <w:r>
-        <w:t xml:space="preserve">, digite </w:t>
-      </w:r>
-      <w:r>
-        <w:rPr>
-          <w:rFonts w:ascii="Courier New" w:hAnsi="Courier New"/>
-          <w:sz w:val="19"/>
-        </w:rPr>
-        <w:t xml:space="preserve">cd </w:t>
-      </w:r>
-      <w:r>
-        <w:t xml:space="preserve"> com um espaço, arraste a pasta </w:t>
-      </w:r>
-      <w:r>
-        <w:rPr>
-          <w:b/>
-        </w:rPr>
-        <w:t>Entrega_EDA_Alunos</w:t>
-      </w:r>
-      <w:r>
-        <w:t xml:space="preserve"> para a janela e pressione Enter. Execute:</w:t>
-      </w:r>
+        <w:t>Mac no Terminal:</w:t>
+      </w:r>
+      <w:r/>
     </w:p>
     <w:p>
       <w:pPr>
@@ -238,38 +195,8 @@
       </w:r>
     </w:p>
     <w:p>
-      <w:pPr>
-        <w:pStyle w:val="Heading2"/>
-      </w:pPr>
-      <w:r>
-        <w:t>4 Acompanhe as permissões e o reinício</w:t>
-      </w:r>
-    </w:p>
-    <w:p>
-      <w:r>
-        <w:t xml:space="preserve">Se o Windows pedir administrador, reabra o PowerShell como administrador na mesma pasta e repita o comando. Se aparecer </w:t>
-      </w:r>
-      <w:r>
-        <w:rPr>
-          <w:b/>
-        </w:rPr>
-        <w:t>REINICIO NECESSARIO</w:t>
-      </w:r>
-      <w:r>
-        <w:t>, reinicie o computador e repita o comando. Bloqueios corporativos devem ser tratados com a TI.</w:t>
-      </w:r>
-    </w:p>
-    <w:p>
-      <w:pPr>
-        <w:pStyle w:val="Heading2"/>
-      </w:pPr>
-      <w:r>
-        <w:t>5 Confirme PRONTO e a retomada dos exercícios</w:t>
-      </w:r>
-    </w:p>
-    <w:p>
-      <w:r>
-        <w:t xml:space="preserve">Peça a confirmação de </w:t>
+      <w:r>
+        <w:t xml:space="preserve">Aguarde </w:t>
       </w:r>
       <w:r>
         <w:rPr>
@@ -278,38 +205,25 @@
         <w:t>PRONTO</w:t>
       </w:r>
       <w:r>
-        <w:t xml:space="preserve"> e que abram na IDE o projeto novo indicado ao final. O teste HTTP da aula 1 já terá passado. Retomem somente os arquivos dos exercícios necessários, sem copiar </w:t>
+        <w:t xml:space="preserve">. Se o Windows pedir administrador ou reinício, siga a solicitação e repita o comando na mesma pasta. Os preparadores atendem ao fluxo em containers; </w:t>
       </w:r>
       <w:r>
         <w:rPr>
           <w:b/>
         </w:rPr>
-        <w:t>.git</w:t>
-      </w:r>
-      <w:r>
-        <w:t xml:space="preserve"> nem substituir o projeto inteiro. Mantenham o backup até conferir tudo. Em caso de erro, peça a mensagem completa ou uma captura da tela antes da aula.</w:t>
-      </w:r>
-    </w:p>
-    <w:p>
-      <w:pPr>
-        <w:pStyle w:val="Heading2"/>
-      </w:pPr>
-      <w:r>
-        <w:t>6 Comece a aula e encerre preservando os dados</w:t>
-      </w:r>
-    </w:p>
-    <w:p>
-      <w:r>
-        <w:t xml:space="preserve">No projeto novo, siga </w:t>
+        <w:t>não instalam JDK e Maven no host</w:t>
+      </w:r>
+      <w:r>
+        <w:t xml:space="preserve">. Para conduzir pelo Maven no computador, prepare também </w:t>
       </w:r>
       <w:r>
         <w:rPr>
           <w:b/>
         </w:rPr>
-        <w:t>docs/AULA-1.md</w:t>
-      </w:r>
-      <w:r>
-        <w:t>. O preparador já fez o novo clone; não é necessário repetir a instalação manual. Ao encerrar, no terminal da pasta do projeto, execute:</w:t>
+        <w:t>JDK 25 e Maven 3.9</w:t>
+      </w:r>
+      <w:r>
+        <w:t xml:space="preserve"> e confira:</w:t>
       </w:r>
     </w:p>
     <w:p>
@@ -323,7 +237,1825 @@
           <w:rFonts w:ascii="Courier New" w:hAnsi="Courier New"/>
           <w:sz w:val="18"/>
         </w:rPr>
+        <w:t>java -version</w:t>
+        <w:br/>
+        <w:t>mvn -version</w:t>
+      </w:r>
+    </w:p>
+    <w:p>
+      <w:r>
+        <w:t xml:space="preserve">O Maven deve indicar Java 25. Confirme Podman e Compose funcionando. Nas páginas seguintes, comandos são executados na raiz do projeto, onde estão </w:t>
+      </w:r>
+      <w:r>
+        <w:rPr>
+          <w:rFonts w:ascii="Courier New" w:hAnsi="Courier New"/>
+          <w:sz w:val="19"/>
+        </w:rPr>
+        <w:t>pom.xml</w:t>
+      </w:r>
+      <w:r>
+        <w:t xml:space="preserve"> e </w:t>
+      </w:r>
+      <w:r>
+        <w:rPr>
+          <w:rFonts w:ascii="Courier New" w:hAnsi="Courier New"/>
+          <w:sz w:val="19"/>
+        </w:rPr>
+        <w:t>compose.yaml</w:t>
+      </w:r>
+      <w:r>
+        <w:t xml:space="preserve">. No Windows, use </w:t>
+      </w:r>
+      <w:r>
+        <w:rPr>
+          <w:rFonts w:ascii="Courier New" w:hAnsi="Courier New"/>
+          <w:sz w:val="19"/>
+        </w:rPr>
+        <w:t>python</w:t>
+      </w:r>
+      <w:r>
+        <w:t xml:space="preserve"> no lugar de </w:t>
+      </w:r>
+      <w:r>
+        <w:rPr>
+          <w:rFonts w:ascii="Courier New" w:hAnsi="Courier New"/>
+          <w:sz w:val="19"/>
+        </w:rPr>
+        <w:t>python3</w:t>
+      </w:r>
+      <w:r>
+        <w:t xml:space="preserve"> se esse for o comando disponível para Python 3.10 ou superior.</w:t>
+      </w:r>
+    </w:p>
+    <w:p>
+      <w:pPr>
+        <w:pStyle w:val="Heading2"/>
+      </w:pPr>
+      <w:r>
+        <w:t>Apresente as quatro camadas</w:t>
+      </w:r>
+    </w:p>
+    <w:tbl>
+      <w:tblPr>
+        <w:tblW w:type="auto" w:w="0"/>
+        <w:jc w:val="center"/>
+        <w:tblLayout w:type="fixed"/>
+        <w:tblLook w:firstColumn="1" w:firstRow="1" w:lastColumn="0" w:lastRow="0" w:noHBand="0" w:noVBand="1" w:val="04A0"/>
+      </w:tblPr>
+      <w:tblGrid>
+        <w:gridCol w:w="1332"/>
+        <w:gridCol w:w="3969"/>
+        <w:gridCol w:w="4450"/>
+      </w:tblGrid>
+      <w:tr>
+        <w:trPr>
+          <w:cantSplit/>
+          <w:tblHeader/>
+        </w:trPr>
+        <w:tc>
+          <w:tcPr>
+            <w:tcW w:type="dxa" w:w="1332"/>
+            <w:vAlign w:val="center"/>
+            <w:tcBorders>
+              <w:top w:val="single" w:sz="4" w:color="D9D9D9"/>
+              <w:left w:val="single" w:sz="4" w:color="D9D9D9"/>
+              <w:bottom w:val="single" w:sz="4" w:color="D9D9D9"/>
+              <w:right w:val="single" w:sz="4" w:color="D9D9D9"/>
+            </w:tcBorders>
+            <w:tcMar>
+              <w:top w:w="60" w:type="dxa"/>
+              <w:bottom w:w="60" w:type="dxa"/>
+              <w:left w:w="80" w:type="dxa"/>
+              <w:right w:w="80" w:type="dxa"/>
+            </w:tcMar>
+            <w:shd w:fill="E8EDF2"/>
+          </w:tcPr>
+          <w:p>
+            <w:pPr>
+              <w:spacing w:after="40" w:line="240" w:lineRule="auto"/>
+            </w:pPr>
+            <w:r>
+              <w:rPr>
+                <w:rFonts w:ascii="Arial" w:hAnsi="Arial"/>
+                <w:b/>
+                <w:sz w:val="18"/>
+              </w:rPr>
+              <w:t>Camada</w:t>
+            </w:r>
+          </w:p>
+        </w:tc>
+        <w:tc>
+          <w:tcPr>
+            <w:tcW w:type="dxa" w:w="3969"/>
+            <w:vAlign w:val="center"/>
+            <w:tcBorders>
+              <w:top w:val="single" w:sz="4" w:color="D9D9D9"/>
+              <w:left w:val="single" w:sz="4" w:color="D9D9D9"/>
+              <w:bottom w:val="single" w:sz="4" w:color="D9D9D9"/>
+              <w:right w:val="single" w:sz="4" w:color="D9D9D9"/>
+            </w:tcBorders>
+            <w:tcMar>
+              <w:top w:w="60" w:type="dxa"/>
+              <w:bottom w:w="60" w:type="dxa"/>
+              <w:left w:w="80" w:type="dxa"/>
+              <w:right w:w="80" w:type="dxa"/>
+            </w:tcMar>
+            <w:shd w:fill="E8EDF2"/>
+          </w:tcPr>
+          <w:p>
+            <w:pPr>
+              <w:spacing w:after="40" w:line="240" w:lineRule="auto"/>
+            </w:pPr>
+            <w:r>
+              <w:rPr>
+                <w:rFonts w:ascii="Arial" w:hAnsi="Arial"/>
+                <w:b/>
+                <w:sz w:val="18"/>
+              </w:rPr>
+              <w:t>Papel na aula</w:t>
+            </w:r>
+          </w:p>
+        </w:tc>
+        <w:tc>
+          <w:tcPr>
+            <w:tcW w:type="dxa" w:w="4450"/>
+            <w:vAlign w:val="center"/>
+            <w:tcBorders>
+              <w:top w:val="single" w:sz="4" w:color="D9D9D9"/>
+              <w:left w:val="single" w:sz="4" w:color="D9D9D9"/>
+              <w:bottom w:val="single" w:sz="4" w:color="D9D9D9"/>
+              <w:right w:val="single" w:sz="4" w:color="D9D9D9"/>
+            </w:tcBorders>
+            <w:tcMar>
+              <w:top w:w="60" w:type="dxa"/>
+              <w:bottom w:w="60" w:type="dxa"/>
+              <w:left w:w="80" w:type="dxa"/>
+              <w:right w:w="80" w:type="dxa"/>
+            </w:tcMar>
+            <w:shd w:fill="E8EDF2"/>
+          </w:tcPr>
+          <w:p>
+            <w:pPr>
+              <w:spacing w:after="40" w:line="240" w:lineRule="auto"/>
+            </w:pPr>
+            <w:r>
+              <w:rPr>
+                <w:rFonts w:ascii="Arial" w:hAnsi="Arial"/>
+                <w:b/>
+                <w:sz w:val="18"/>
+              </w:rPr>
+              <w:t>O que ler</w:t>
+            </w:r>
+          </w:p>
+        </w:tc>
+      </w:tr>
+      <w:tr>
+        <w:trPr>
+          <w:cantSplit/>
+        </w:trPr>
+        <w:tc>
+          <w:tcPr>
+            <w:tcW w:type="dxa" w:w="1332"/>
+            <w:vAlign w:val="center"/>
+            <w:tcBorders>
+              <w:top w:val="single" w:sz="4" w:color="D9D9D9"/>
+              <w:left w:val="single" w:sz="4" w:color="D9D9D9"/>
+              <w:bottom w:val="single" w:sz="4" w:color="D9D9D9"/>
+              <w:right w:val="single" w:sz="4" w:color="D9D9D9"/>
+            </w:tcBorders>
+            <w:tcMar>
+              <w:top w:w="60" w:type="dxa"/>
+              <w:bottom w:w="60" w:type="dxa"/>
+              <w:left w:w="80" w:type="dxa"/>
+              <w:right w:w="80" w:type="dxa"/>
+            </w:tcMar>
+          </w:tcPr>
+          <w:p>
+            <w:pPr>
+              <w:spacing w:after="40" w:line="240" w:lineRule="auto"/>
+            </w:pPr>
+            <w:r>
+              <w:rPr>
+                <w:rFonts w:ascii="Arial" w:hAnsi="Arial"/>
+                <w:b w:val="0"/>
+                <w:sz w:val="18"/>
+              </w:rPr>
+              <w:t>domain</w:t>
+            </w:r>
+          </w:p>
+        </w:tc>
+        <w:tc>
+          <w:tcPr>
+            <w:tcW w:type="dxa" w:w="3969"/>
+            <w:vAlign w:val="center"/>
+            <w:tcBorders>
+              <w:top w:val="single" w:sz="4" w:color="D9D9D9"/>
+              <w:left w:val="single" w:sz="4" w:color="D9D9D9"/>
+              <w:bottom w:val="single" w:sz="4" w:color="D9D9D9"/>
+              <w:right w:val="single" w:sz="4" w:color="D9D9D9"/>
+            </w:tcBorders>
+            <w:tcMar>
+              <w:top w:w="60" w:type="dxa"/>
+              <w:bottom w:w="60" w:type="dxa"/>
+              <w:left w:w="80" w:type="dxa"/>
+              <w:right w:w="80" w:type="dxa"/>
+            </w:tcMar>
+          </w:tcPr>
+          <w:p>
+            <w:pPr>
+              <w:spacing w:after="40" w:line="240" w:lineRule="auto"/>
+            </w:pPr>
+            <w:r>
+              <w:rPr>
+                <w:rFonts w:ascii="Arial" w:hAnsi="Arial"/>
+                <w:b w:val="0"/>
+                <w:sz w:val="18"/>
+              </w:rPr>
+              <w:t>Entidades, casos de uso e portas sem Spring</w:t>
+            </w:r>
+          </w:p>
+        </w:tc>
+        <w:tc>
+          <w:tcPr>
+            <w:tcW w:type="dxa" w:w="4450"/>
+            <w:vAlign w:val="center"/>
+            <w:tcBorders>
+              <w:top w:val="single" w:sz="4" w:color="D9D9D9"/>
+              <w:left w:val="single" w:sz="4" w:color="D9D9D9"/>
+              <w:bottom w:val="single" w:sz="4" w:color="D9D9D9"/>
+              <w:right w:val="single" w:sz="4" w:color="D9D9D9"/>
+            </w:tcBorders>
+            <w:tcMar>
+              <w:top w:w="60" w:type="dxa"/>
+              <w:bottom w:w="60" w:type="dxa"/>
+              <w:left w:w="80" w:type="dxa"/>
+              <w:right w:w="80" w:type="dxa"/>
+            </w:tcMar>
+          </w:tcPr>
+          <w:p>
+            <w:pPr>
+              <w:spacing w:after="40" w:line="240" w:lineRule="auto"/>
+            </w:pPr>
+            <w:r>
+              <w:rPr>
+                <w:rFonts w:ascii="Arial" w:hAnsi="Arial"/>
+                <w:b w:val="0"/>
+                <w:sz w:val="18"/>
+              </w:rPr>
+              <w:t>ordens-domain, domain/usecase e domain/port/out</w:t>
+            </w:r>
+          </w:p>
+        </w:tc>
+      </w:tr>
+      <w:tr>
+        <w:trPr>
+          <w:cantSplit/>
+        </w:trPr>
+        <w:tc>
+          <w:tcPr>
+            <w:tcW w:type="dxa" w:w="1332"/>
+            <w:vAlign w:val="center"/>
+            <w:tcBorders>
+              <w:top w:val="single" w:sz="4" w:color="D9D9D9"/>
+              <w:left w:val="single" w:sz="4" w:color="D9D9D9"/>
+              <w:bottom w:val="single" w:sz="4" w:color="D9D9D9"/>
+              <w:right w:val="single" w:sz="4" w:color="D9D9D9"/>
+            </w:tcBorders>
+            <w:tcMar>
+              <w:top w:w="60" w:type="dxa"/>
+              <w:bottom w:w="60" w:type="dxa"/>
+              <w:left w:w="80" w:type="dxa"/>
+              <w:right w:w="80" w:type="dxa"/>
+            </w:tcMar>
+          </w:tcPr>
+          <w:p>
+            <w:pPr>
+              <w:spacing w:after="40" w:line="240" w:lineRule="auto"/>
+            </w:pPr>
+            <w:r>
+              <w:rPr>
+                <w:rFonts w:ascii="Arial" w:hAnsi="Arial"/>
+                <w:b w:val="0"/>
+                <w:sz w:val="18"/>
+              </w:rPr>
+              <w:t>controller</w:t>
+            </w:r>
+          </w:p>
+        </w:tc>
+        <w:tc>
+          <w:tcPr>
+            <w:tcW w:type="dxa" w:w="3969"/>
+            <w:vAlign w:val="center"/>
+            <w:tcBorders>
+              <w:top w:val="single" w:sz="4" w:color="D9D9D9"/>
+              <w:left w:val="single" w:sz="4" w:color="D9D9D9"/>
+              <w:bottom w:val="single" w:sz="4" w:color="D9D9D9"/>
+              <w:right w:val="single" w:sz="4" w:color="D9D9D9"/>
+            </w:tcBorders>
+            <w:tcMar>
+              <w:top w:w="60" w:type="dxa"/>
+              <w:bottom w:w="60" w:type="dxa"/>
+              <w:left w:w="80" w:type="dxa"/>
+              <w:right w:w="80" w:type="dxa"/>
+            </w:tcMar>
+          </w:tcPr>
+          <w:p>
+            <w:pPr>
+              <w:spacing w:after="40" w:line="240" w:lineRule="auto"/>
+            </w:pPr>
+            <w:r>
+              <w:rPr>
+                <w:rFonts w:ascii="Arial" w:hAnsi="Arial"/>
+                <w:b w:val="0"/>
+                <w:sz w:val="18"/>
+              </w:rPr>
+              <w:t>Receber HTTP, mensagens e agendamentos</w:t>
+            </w:r>
+          </w:p>
+        </w:tc>
+        <w:tc>
+          <w:tcPr>
+            <w:tcW w:type="dxa" w:w="4450"/>
+            <w:vAlign w:val="center"/>
+            <w:tcBorders>
+              <w:top w:val="single" w:sz="4" w:color="D9D9D9"/>
+              <w:left w:val="single" w:sz="4" w:color="D9D9D9"/>
+              <w:bottom w:val="single" w:sz="4" w:color="D9D9D9"/>
+              <w:right w:val="single" w:sz="4" w:color="D9D9D9"/>
+            </w:tcBorders>
+            <w:tcMar>
+              <w:top w:w="60" w:type="dxa"/>
+              <w:bottom w:w="60" w:type="dxa"/>
+              <w:left w:w="80" w:type="dxa"/>
+              <w:right w:w="80" w:type="dxa"/>
+            </w:tcMar>
+          </w:tcPr>
+          <w:p>
+            <w:pPr>
+              <w:spacing w:after="40" w:line="240" w:lineRule="auto"/>
+            </w:pPr>
+            <w:r>
+              <w:rPr>
+                <w:rFonts w:ascii="Arial" w:hAnsi="Arial"/>
+                <w:b w:val="0"/>
+                <w:sz w:val="18"/>
+              </w:rPr>
+              <w:t>controller/http, messaging e scheduling</w:t>
+            </w:r>
+          </w:p>
+        </w:tc>
+      </w:tr>
+      <w:tr>
+        <w:trPr>
+          <w:cantSplit/>
+        </w:trPr>
+        <w:tc>
+          <w:tcPr>
+            <w:tcW w:type="dxa" w:w="1332"/>
+            <w:vAlign w:val="center"/>
+            <w:tcBorders>
+              <w:top w:val="single" w:sz="4" w:color="D9D9D9"/>
+              <w:left w:val="single" w:sz="4" w:color="D9D9D9"/>
+              <w:bottom w:val="single" w:sz="4" w:color="D9D9D9"/>
+              <w:right w:val="single" w:sz="4" w:color="D9D9D9"/>
+            </w:tcBorders>
+            <w:tcMar>
+              <w:top w:w="60" w:type="dxa"/>
+              <w:bottom w:w="60" w:type="dxa"/>
+              <w:left w:w="80" w:type="dxa"/>
+              <w:right w:w="80" w:type="dxa"/>
+            </w:tcMar>
+          </w:tcPr>
+          <w:p>
+            <w:pPr>
+              <w:spacing w:after="40" w:line="240" w:lineRule="auto"/>
+            </w:pPr>
+            <w:r>
+              <w:rPr>
+                <w:rFonts w:ascii="Arial" w:hAnsi="Arial"/>
+                <w:b w:val="0"/>
+                <w:sz w:val="18"/>
+              </w:rPr>
+              <w:t>presenter</w:t>
+            </w:r>
+          </w:p>
+        </w:tc>
+        <w:tc>
+          <w:tcPr>
+            <w:tcW w:type="dxa" w:w="3969"/>
+            <w:vAlign w:val="center"/>
+            <w:tcBorders>
+              <w:top w:val="single" w:sz="4" w:color="D9D9D9"/>
+              <w:left w:val="single" w:sz="4" w:color="D9D9D9"/>
+              <w:bottom w:val="single" w:sz="4" w:color="D9D9D9"/>
+              <w:right w:val="single" w:sz="4" w:color="D9D9D9"/>
+            </w:tcBorders>
+            <w:tcMar>
+              <w:top w:w="60" w:type="dxa"/>
+              <w:bottom w:w="60" w:type="dxa"/>
+              <w:left w:w="80" w:type="dxa"/>
+              <w:right w:w="80" w:type="dxa"/>
+            </w:tcMar>
+          </w:tcPr>
+          <w:p>
+            <w:pPr>
+              <w:spacing w:after="40" w:line="240" w:lineRule="auto"/>
+            </w:pPr>
+            <w:r>
+              <w:rPr>
+                <w:rFonts w:ascii="Arial" w:hAnsi="Arial"/>
+                <w:b w:val="0"/>
+                <w:sz w:val="18"/>
+              </w:rPr>
+              <w:t>Preparar respostas HTTP e contratos externos</w:t>
+            </w:r>
+          </w:p>
+        </w:tc>
+        <w:tc>
+          <w:tcPr>
+            <w:tcW w:type="dxa" w:w="4450"/>
+            <w:vAlign w:val="center"/>
+            <w:tcBorders>
+              <w:top w:val="single" w:sz="4" w:color="D9D9D9"/>
+              <w:left w:val="single" w:sz="4" w:color="D9D9D9"/>
+              <w:bottom w:val="single" w:sz="4" w:color="D9D9D9"/>
+              <w:right w:val="single" w:sz="4" w:color="D9D9D9"/>
+            </w:tcBorders>
+            <w:tcMar>
+              <w:top w:w="60" w:type="dxa"/>
+              <w:bottom w:w="60" w:type="dxa"/>
+              <w:left w:w="80" w:type="dxa"/>
+              <w:right w:w="80" w:type="dxa"/>
+            </w:tcMar>
+          </w:tcPr>
+          <w:p>
+            <w:pPr>
+              <w:spacing w:after="40" w:line="240" w:lineRule="auto"/>
+            </w:pPr>
+            <w:r>
+              <w:rPr>
+                <w:rFonts w:ascii="Arial" w:hAnsi="Arial"/>
+                <w:b w:val="0"/>
+                <w:sz w:val="18"/>
+              </w:rPr>
+              <w:t>Presenters e presenter/contract</w:t>
+            </w:r>
+          </w:p>
+        </w:tc>
+      </w:tr>
+      <w:tr>
+        <w:trPr>
+          <w:cantSplit/>
+        </w:trPr>
+        <w:tc>
+          <w:tcPr>
+            <w:tcW w:type="dxa" w:w="1332"/>
+            <w:vAlign w:val="center"/>
+            <w:tcBorders>
+              <w:top w:val="single" w:sz="4" w:color="D9D9D9"/>
+              <w:left w:val="single" w:sz="4" w:color="D9D9D9"/>
+              <w:bottom w:val="single" w:sz="4" w:color="D9D9D9"/>
+              <w:right w:val="single" w:sz="4" w:color="D9D9D9"/>
+            </w:tcBorders>
+            <w:tcMar>
+              <w:top w:w="60" w:type="dxa"/>
+              <w:bottom w:w="60" w:type="dxa"/>
+              <w:left w:w="80" w:type="dxa"/>
+              <w:right w:w="80" w:type="dxa"/>
+            </w:tcMar>
+          </w:tcPr>
+          <w:p>
+            <w:pPr>
+              <w:spacing w:after="40" w:line="240" w:lineRule="auto"/>
+            </w:pPr>
+            <w:r>
+              <w:rPr>
+                <w:rFonts w:ascii="Arial" w:hAnsi="Arial"/>
+                <w:b w:val="0"/>
+                <w:sz w:val="18"/>
+              </w:rPr>
+              <w:t>infra</w:t>
+            </w:r>
+          </w:p>
+        </w:tc>
+        <w:tc>
+          <w:tcPr>
+            <w:tcW w:type="dxa" w:w="3969"/>
+            <w:vAlign w:val="center"/>
+            <w:tcBorders>
+              <w:top w:val="single" w:sz="4" w:color="D9D9D9"/>
+              <w:left w:val="single" w:sz="4" w:color="D9D9D9"/>
+              <w:bottom w:val="single" w:sz="4" w:color="D9D9D9"/>
+              <w:right w:val="single" w:sz="4" w:color="D9D9D9"/>
+            </w:tcBorders>
+            <w:tcMar>
+              <w:top w:w="60" w:type="dxa"/>
+              <w:bottom w:w="60" w:type="dxa"/>
+              <w:left w:w="80" w:type="dxa"/>
+              <w:right w:w="80" w:type="dxa"/>
+            </w:tcMar>
+          </w:tcPr>
+          <w:p>
+            <w:pPr>
+              <w:spacing w:after="40" w:line="240" w:lineRule="auto"/>
+            </w:pPr>
+            <w:r>
+              <w:rPr>
+                <w:rFonts w:ascii="Arial" w:hAnsi="Arial"/>
+                <w:b w:val="0"/>
+                <w:sz w:val="18"/>
+              </w:rPr>
+              <w:t>Implementar portas e compor os objetos</w:t>
+            </w:r>
+          </w:p>
+        </w:tc>
+        <w:tc>
+          <w:tcPr>
+            <w:tcW w:type="dxa" w:w="4450"/>
+            <w:vAlign w:val="center"/>
+            <w:tcBorders>
+              <w:top w:val="single" w:sz="4" w:color="D9D9D9"/>
+              <w:left w:val="single" w:sz="4" w:color="D9D9D9"/>
+              <w:bottom w:val="single" w:sz="4" w:color="D9D9D9"/>
+              <w:right w:val="single" w:sz="4" w:color="D9D9D9"/>
+            </w:tcBorders>
+            <w:tcMar>
+              <w:top w:w="60" w:type="dxa"/>
+              <w:bottom w:w="60" w:type="dxa"/>
+              <w:left w:w="80" w:type="dxa"/>
+              <w:right w:w="80" w:type="dxa"/>
+            </w:tcMar>
+          </w:tcPr>
+          <w:p>
+            <w:pPr>
+              <w:spacing w:after="40" w:line="240" w:lineRule="auto"/>
+            </w:pPr>
+            <w:r>
+              <w:rPr>
+                <w:rFonts w:ascii="Arial" w:hAnsi="Arial"/>
+                <w:b w:val="0"/>
+                <w:sz w:val="18"/>
+              </w:rPr>
+              <w:t>JDBC, brokers, transações e infra/config</w:t>
+            </w:r>
+          </w:p>
+        </w:tc>
+      </w:tr>
+    </w:tbl>
+    <w:p>
+      <w:pPr>
+        <w:spacing w:before="120"/>
+      </w:pPr>
+      <w:r>
+        <w:t xml:space="preserve">Explique a execução: entrada → controller → caso de uso → porta → infra. Na resposta HTTP: resultado interno → presenter → controller → cliente. A dependência do código aponta para o domínio; o domínio não conhece suas implementações de infra. </w:t>
+      </w:r>
+      <w:r>
+        <w:rPr>
+          <w:rFonts w:ascii="Courier New" w:hAnsi="Courier New"/>
+          <w:sz w:val="19"/>
+        </w:rPr>
+        <w:t>UseCaseConfiguration</w:t>
+      </w:r>
+      <w:r>
+        <w:t xml:space="preserve"> liga tudo por construtores. Nos fluxos assíncronos, o broker ou o agendador inicia outra execução.</w:t>
+      </w:r>
+    </w:p>
+    <w:p>
+      <w:pPr>
+        <w:pStyle w:val="Heading2"/>
+      </w:pPr>
+      <w:r>
+        <w:t>Leitura de apoio</w:t>
+      </w:r>
+    </w:p>
+    <w:p>
+      <w:r>
+        <w:t xml:space="preserve">- </w:t>
+      </w:r>
+      <w:hyperlink r:id="rId10">
+        <w:r>
+          <w:rPr>
+            <w:color w:val="0563C1"/>
+            <w:u w:val="single"/>
+          </w:rPr>
+          <w:t>Arquitetura das quatro camadas</w:t>
+        </w:r>
+      </w:hyperlink>
+      <w:r>
+        <w:t>.</w:t>
+      </w:r>
+    </w:p>
+    <w:p>
+      <w:r>
+        <w:t xml:space="preserve">- </w:t>
+      </w:r>
+      <w:hyperlink r:id="rId11">
+        <w:r>
+          <w:rPr>
+            <w:color w:val="0563C1"/>
+            <w:u w:val="single"/>
+          </w:rPr>
+          <w:t>Catálogo completo de classes e chamadas</w:t>
+        </w:r>
+      </w:hyperlink>
+      <w:r>
+        <w:t>.</w:t>
+      </w:r>
+    </w:p>
+    <w:p>
+      <w:r>
+        <w:t xml:space="preserve">- </w:t>
+      </w:r>
+      <w:hyperlink r:id="rId12">
+        <w:r>
+          <w:rPr>
+            <w:color w:val="0563C1"/>
+            <w:u w:val="single"/>
+          </w:rPr>
+          <w:t>Gabaritos e critérios de avaliação</w:t>
+        </w:r>
+      </w:hyperlink>
+      <w:r>
+        <w:t>.</w:t>
+      </w:r>
+    </w:p>
+    <w:p>
+      <w:r>
+        <w:t xml:space="preserve">- </w:t>
+      </w:r>
+      <w:hyperlink r:id="rId13">
+        <w:r>
+          <w:rPr>
+            <w:color w:val="0563C1"/>
+            <w:u w:val="single"/>
+          </w:rPr>
+          <w:t>Evidências e limites da validação</w:t>
+        </w:r>
+      </w:hyperlink>
+      <w:r>
+        <w:t>.</w:t>
+      </w:r>
+    </w:p>
+    <w:p>
+      <w:r>
+        <w:t xml:space="preserve">- </w:t>
+      </w:r>
+      <w:hyperlink r:id="rId14">
+        <w:r>
+          <w:rPr>
+            <w:color w:val="0563C1"/>
+            <w:u w:val="single"/>
+          </w:rPr>
+          <w:t>Versão deste roteiro em Word</w:t>
+        </w:r>
+      </w:hyperlink>
+      <w:r>
+        <w:t>.</w:t>
+      </w:r>
+    </w:p>
+    <w:p>
+      <w:r>
+        <w:br w:type="page"/>
+      </w:r>
+    </w:p>
+    <w:p>
+      <w:pPr>
+        <w:pStyle w:val="Heading2"/>
+      </w:pPr>
+      <w:r>
+        <w:t>Aula 1 com Maven</w:t>
+      </w:r>
+    </w:p>
+    <w:p>
+      <w:r/>
+      <w:r>
+        <w:rPr>
+          <w:b/>
+        </w:rPr>
+        <w:t>Objetivo:</w:t>
+      </w:r>
+      <w:r>
+        <w:t xml:space="preserve"> receber um comando HTTP, enfileirar no RabbitMQ e publicar um evento Kafka observado por Risco e Auditoria. Divida os três blocos entre vocabulário e domínio, leitura do fluxo e execução com exercícios; desconte os intervalos do tempo disponível.</w:t>
+      </w:r>
+    </w:p>
+    <w:p>
+      <w:pPr>
+        <w:pStyle w:val="Heading2"/>
+      </w:pPr>
+      <w:r>
+        <w:t>Iniciar e testar</w:t>
+      </w:r>
+    </w:p>
+    <w:p>
+      <w:r>
+        <w:t>Na cópia nova do laboratório, depois de salvar alterações e com o diretório de trabalho limpo:</w:t>
+      </w:r>
+    </w:p>
+    <w:p>
+      <w:pPr>
+        <w:keepLines/>
+        <w:spacing w:before="20" w:after="120"/>
+        <w:ind w:left="170"/>
+      </w:pPr>
+      <w:r>
+        <w:rPr>
+          <w:rFonts w:ascii="Courier New" w:hAnsi="Courier New"/>
+          <w:sz w:val="18"/>
+        </w:rPr>
+        <w:t>git status</w:t>
+        <w:br/>
+        <w:t>git switch aula-1</w:t>
+        <w:br/>
+        <w:t>podman compose stop aula1</w:t>
+        <w:br/>
+        <w:t>podman compose up -d rabbitmq kafka</w:t>
+        <w:br/>
+        <w:t>podman compose ps</w:t>
+        <w:br/>
+        <w:t>mvn clean verify</w:t>
+        <w:br/>
+        <w:t>mvn -pl aula1 -am install -DskipTests</w:t>
+        <w:br/>
+        <w:t>mvn -pl aula1 spring-boot:run</w:t>
+      </w:r>
+    </w:p>
+    <w:p>
+      <w:r>
+        <w:t xml:space="preserve">Espere RabbitMQ e Kafka saudáveis antes de iniciar a API. </w:t>
+      </w:r>
+      <w:r>
+        <w:rPr>
+          <w:b/>
+        </w:rPr>
+        <w:t>Esperado:</w:t>
+      </w:r>
+      <w:r>
+        <w:t xml:space="preserve"> 11 testes em </w:t>
+      </w:r>
+      <w:r>
+        <w:rPr>
+          <w:rFonts w:ascii="Courier New" w:hAnsi="Courier New"/>
+          <w:sz w:val="19"/>
+        </w:rPr>
+        <w:t>verify</w:t>
+      </w:r>
+      <w:r>
+        <w:t xml:space="preserve"> e aplicação em </w:t>
+      </w:r>
+      <w:r>
+        <w:rPr>
+          <w:rFonts w:ascii="Courier New" w:hAnsi="Courier New"/>
+          <w:sz w:val="19"/>
+        </w:rPr>
+        <w:t>http://localhost:8080</w:t>
+      </w:r>
+      <w:r>
+        <w:t xml:space="preserve">. O </w:t>
+      </w:r>
+      <w:r>
+        <w:rPr>
+          <w:rFonts w:ascii="Courier New" w:hAnsi="Courier New"/>
+          <w:sz w:val="19"/>
+        </w:rPr>
+        <w:t>install</w:t>
+      </w:r>
+      <w:r>
+        <w:t xml:space="preserve"> prepara o domínio compartilhado no repositório Maven local; só pule os testes nessa etapa porque </w:t>
+      </w:r>
+      <w:r>
+        <w:rPr>
+          <w:rFonts w:ascii="Courier New" w:hAnsi="Courier New"/>
+          <w:sz w:val="19"/>
+        </w:rPr>
+        <w:t>verify</w:t>
+      </w:r>
+      <w:r>
+        <w:t xml:space="preserve"> já os executou. Deixe o terminal do Maven aberto.</w:t>
+      </w:r>
+    </w:p>
+    <w:p>
+      <w:r>
+        <w:t>Em outro terminal, na mesma raiz:</w:t>
+      </w:r>
+    </w:p>
+    <w:p>
+      <w:pPr>
+        <w:keepLines/>
+        <w:spacing w:before="20" w:after="120"/>
+        <w:ind w:left="170"/>
+      </w:pPr>
+      <w:r>
+        <w:rPr>
+          <w:rFonts w:ascii="Courier New" w:hAnsi="Courier New"/>
+          <w:sz w:val="18"/>
+        </w:rPr>
+        <w:t>python3 scripts/smoke.py --aula 1</w:t>
+      </w:r>
+    </w:p>
+    <w:p>
+      <w:r/>
+      <w:r>
+        <w:rPr>
+          <w:b/>
+        </w:rPr>
+        <w:t>Esperado:</w:t>
+      </w:r>
+      <w:r>
+        <w:t xml:space="preserve"> HTTP 202 para comando válido e 400 para entrada inválida. Confirme no terminal Maven os registros de Risco e Auditoria. HTTP 202 confirma o enfileiramento, e o processamento pelo worker acontece depois. O painel RabbitMQ está em </w:t>
+      </w:r>
+      <w:r>
+        <w:rPr>
+          <w:rFonts w:ascii="Courier New" w:hAnsi="Courier New"/>
+          <w:sz w:val="19"/>
+        </w:rPr>
+        <w:t>http://localhost:15673</w:t>
+      </w:r>
+      <w:r>
+        <w:t xml:space="preserve">, com </w:t>
+      </w:r>
+      <w:r>
+        <w:rPr>
+          <w:rFonts w:ascii="Courier New" w:hAnsi="Courier New"/>
+          <w:sz w:val="19"/>
+        </w:rPr>
+        <w:t>aluno</w:t>
+      </w:r>
+      <w:r>
+        <w:t xml:space="preserve"> e </w:t>
+      </w:r>
+      <w:r>
+        <w:rPr>
+          <w:rFonts w:ascii="Courier New" w:hAnsi="Courier New"/>
+          <w:sz w:val="19"/>
+        </w:rPr>
+        <w:t>aluno-local</w:t>
+      </w:r>
+      <w:r>
+        <w:t>.</w:t>
+      </w:r>
+    </w:p>
+    <w:p>
+      <w:pPr>
+        <w:pStyle w:val="Heading2"/>
+      </w:pPr>
+      <w:r>
+        <w:t>Sequência de leitura das classes</w:t>
+      </w:r>
+    </w:p>
+    <w:p>
+      <w:r>
+        <w:t xml:space="preserve">1. </w:t>
+      </w:r>
+      <w:r>
+        <w:rPr>
+          <w:b/>
+        </w:rPr>
+        <w:t>Domínio compartilhado:</w:t>
+      </w:r>
+      <w:r>
+        <w:t xml:space="preserve"> </w:t>
+      </w:r>
+      <w:r>
+        <w:rPr>
+          <w:rFonts w:ascii="Courier New" w:hAnsi="Courier New"/>
+          <w:sz w:val="19"/>
+        </w:rPr>
+        <w:t>Order</w:t>
+      </w:r>
+      <w:r>
+        <w:t xml:space="preserve"> protege as invariantes e </w:t>
+      </w:r>
+      <w:r>
+        <w:rPr>
+          <w:rFonts w:ascii="Courier New" w:hAnsi="Courier New"/>
+          <w:sz w:val="19"/>
+        </w:rPr>
+        <w:t>OrderAccepted</w:t>
+      </w:r>
+      <w:r>
+        <w:t xml:space="preserve"> representa o fato aceito. Mostre que os dois não conhecem HTTP, Spring ou brokers.</w:t>
+      </w:r>
+    </w:p>
+    <w:p>
+      <w:r>
+        <w:t xml:space="preserve">2. </w:t>
+      </w:r>
+      <w:r>
+        <w:rPr>
+          <w:b/>
+        </w:rPr>
+        <w:t>Caso de uso e porta:</w:t>
+      </w:r>
+      <w:r>
+        <w:t xml:space="preserve"> </w:t>
+      </w:r>
+      <w:r>
+        <w:rPr>
+          <w:rFonts w:ascii="Courier New" w:hAnsi="Courier New"/>
+          <w:sz w:val="19"/>
+        </w:rPr>
+        <w:t>SubmitOrderUseCase</w:t>
+      </w:r>
+      <w:r>
+        <w:t xml:space="preserve"> cria a ordem e chama </w:t>
+      </w:r>
+      <w:r>
+        <w:rPr>
+          <w:rFonts w:ascii="Courier New" w:hAnsi="Courier New"/>
+          <w:sz w:val="19"/>
+        </w:rPr>
+        <w:t>OrderCommandPublisher</w:t>
+      </w:r>
+      <w:r>
+        <w:t>. A implementação concreta é fornecida por infra, sem mudar o caso de uso.</w:t>
+      </w:r>
+    </w:p>
+    <w:p>
+      <w:r>
+        <w:t xml:space="preserve">3. </w:t>
+      </w:r>
+      <w:r>
+        <w:rPr>
+          <w:b/>
+        </w:rPr>
+        <w:t>Entrada e saída HTTP:</w:t>
+      </w:r>
+      <w:r>
+        <w:t xml:space="preserve"> </w:t>
+      </w:r>
+      <w:r>
+        <w:rPr>
+          <w:rFonts w:ascii="Courier New" w:hAnsi="Courier New"/>
+          <w:sz w:val="19"/>
+        </w:rPr>
+        <w:t>OrderController.create</w:t>
+      </w:r>
+      <w:r>
+        <w:t xml:space="preserve"> valida a requisição, chama o caso de uso e entrega o ID ao </w:t>
+      </w:r>
+      <w:r>
+        <w:rPr>
+          <w:rFonts w:ascii="Courier New" w:hAnsi="Courier New"/>
+          <w:sz w:val="19"/>
+        </w:rPr>
+        <w:t>OrderPresenter.accepted</w:t>
+      </w:r>
+      <w:r>
+        <w:t xml:space="preserve">. O presenter monta </w:t>
+      </w:r>
+      <w:r>
+        <w:rPr>
+          <w:rFonts w:ascii="Courier New" w:hAnsi="Courier New"/>
+          <w:sz w:val="19"/>
+        </w:rPr>
+        <w:t>AcceptedOrderResponse</w:t>
+      </w:r>
+      <w:r>
+        <w:t xml:space="preserve"> para HTTP 202.</w:t>
+      </w:r>
+    </w:p>
+    <w:p>
+      <w:r>
+        <w:t xml:space="preserve">4. </w:t>
+      </w:r>
+      <w:r>
+        <w:rPr>
+          <w:b/>
+        </w:rPr>
+        <w:t>Enfileiramento:</w:t>
+      </w:r>
+      <w:r>
+        <w:t xml:space="preserve"> </w:t>
+      </w:r>
+      <w:r>
+        <w:rPr>
+          <w:rFonts w:ascii="Courier New" w:hAnsi="Courier New"/>
+          <w:sz w:val="19"/>
+        </w:rPr>
+        <w:t>RabbitOrderCommandPublisher</w:t>
+      </w:r>
+      <w:r>
+        <w:t xml:space="preserve"> converte com </w:t>
+      </w:r>
+      <w:r>
+        <w:rPr>
+          <w:rFonts w:ascii="Courier New" w:hAnsi="Courier New"/>
+          <w:sz w:val="19"/>
+        </w:rPr>
+        <w:t>OrderCommand</w:t>
+      </w:r>
+      <w:r>
+        <w:t>, serializa e aguarda a confirmação do RabbitMQ. Mostre o limite entre contrato externo e entidade.</w:t>
+      </w:r>
+    </w:p>
+    <w:p>
+      <w:r>
+        <w:t xml:space="preserve">5. </w:t>
+      </w:r>
+      <w:r>
+        <w:rPr>
+          <w:b/>
+        </w:rPr>
+        <w:t>Processamento assíncrono:</w:t>
+      </w:r>
+      <w:r>
+        <w:t xml:space="preserve"> </w:t>
+      </w:r>
+      <w:r>
+        <w:rPr>
+          <w:rFonts w:ascii="Courier New" w:hAnsi="Courier New"/>
+          <w:sz w:val="19"/>
+        </w:rPr>
+        <w:t>OrderWorker</w:t>
+      </w:r>
+      <w:r>
+        <w:t xml:space="preserve"> converte o comando e chama </w:t>
+      </w:r>
+      <w:r>
+        <w:rPr>
+          <w:rFonts w:ascii="Courier New" w:hAnsi="Courier New"/>
+          <w:sz w:val="19"/>
+        </w:rPr>
+        <w:t>AcceptOrderUseCase</w:t>
+      </w:r>
+      <w:r>
+        <w:t xml:space="preserve">; este usa </w:t>
+      </w:r>
+      <w:r>
+        <w:rPr>
+          <w:rFonts w:ascii="Courier New" w:hAnsi="Courier New"/>
+          <w:sz w:val="19"/>
+        </w:rPr>
+        <w:t>OrderEventPublisher</w:t>
+      </w:r>
+      <w:r>
+        <w:t xml:space="preserve">, implementada por </w:t>
+      </w:r>
+      <w:r>
+        <w:rPr>
+          <w:rFonts w:ascii="Courier New" w:hAnsi="Courier New"/>
+          <w:sz w:val="19"/>
+        </w:rPr>
+        <w:t>KafkaOrderEventPublisher</w:t>
+      </w:r>
+      <w:r>
+        <w:t xml:space="preserve">. </w:t>
+      </w:r>
+      <w:r>
+        <w:rPr>
+          <w:rFonts w:ascii="Courier New" w:hAnsi="Courier New"/>
+          <w:sz w:val="19"/>
+        </w:rPr>
+        <w:t>AcceptedEventMessage</w:t>
+      </w:r>
+      <w:r>
+        <w:t xml:space="preserve"> prepara o formato externo. </w:t>
+      </w:r>
+      <w:r>
+        <w:rPr>
+          <w:rFonts w:ascii="Courier New" w:hAnsi="Courier New"/>
+          <w:sz w:val="19"/>
+        </w:rPr>
+        <w:t>EventSubscribers</w:t>
+      </w:r>
+      <w:r>
+        <w:t xml:space="preserve"> demonstra os dois grupos Kafka independentes.</w:t>
+      </w:r>
+    </w:p>
+    <w:p>
+      <w:r>
+        <w:t xml:space="preserve">6. </w:t>
+      </w:r>
+      <w:r>
+        <w:rPr>
+          <w:b/>
+        </w:rPr>
+        <w:t>Composição e proteção:</w:t>
+      </w:r>
+      <w:r>
+        <w:t xml:space="preserve"> </w:t>
+      </w:r>
+      <w:r>
+        <w:rPr>
+          <w:rFonts w:ascii="Courier New" w:hAnsi="Courier New"/>
+          <w:sz w:val="19"/>
+        </w:rPr>
+        <w:t>Topology</w:t>
+      </w:r>
+      <w:r>
+        <w:t xml:space="preserve"> cria fila/tópico e </w:t>
+      </w:r>
+      <w:r>
+        <w:rPr>
+          <w:rFonts w:ascii="Courier New" w:hAnsi="Courier New"/>
+          <w:sz w:val="19"/>
+        </w:rPr>
+        <w:t>UseCaseConfiguration</w:t>
+      </w:r>
+      <w:r>
+        <w:t xml:space="preserve"> injeta portas e presenter. Termine com </w:t>
+      </w:r>
+      <w:r>
+        <w:rPr>
+          <w:rFonts w:ascii="Courier New" w:hAnsi="Courier New"/>
+          <w:sz w:val="19"/>
+        </w:rPr>
+        <w:t>OrderUseCasesTest</w:t>
+      </w:r>
+      <w:r>
+        <w:t xml:space="preserve">, </w:t>
+      </w:r>
+      <w:r>
+        <w:rPr>
+          <w:rFonts w:ascii="Courier New" w:hAnsi="Courier New"/>
+          <w:sz w:val="19"/>
+        </w:rPr>
+        <w:t>HttpContractTest</w:t>
+      </w:r>
+      <w:r>
+        <w:t xml:space="preserve"> e </w:t>
+      </w:r>
+      <w:r>
+        <w:rPr>
+          <w:rFonts w:ascii="Courier New" w:hAnsi="Courier New"/>
+          <w:sz w:val="19"/>
+        </w:rPr>
+        <w:t>ArchitectureTest</w:t>
+      </w:r>
+      <w:r>
+        <w:t>: decisões do caso, contrato HTTP e dependências das camadas.</w:t>
+      </w:r>
+    </w:p>
+    <w:p>
+      <w:pPr>
+        <w:pStyle w:val="Heading2"/>
+      </w:pPr>
+      <w:r>
+        <w:t>Fechar a aula e preparar a troca</w:t>
+      </w:r>
+    </w:p>
+    <w:p>
+      <w:r>
+        <w:t xml:space="preserve">Encerre a aplicação com </w:t>
+      </w:r>
+      <w:r>
+        <w:rPr>
+          <w:b/>
+        </w:rPr>
+        <w:t>Ctrl+C</w:t>
+      </w:r>
+      <w:r>
+        <w:t xml:space="preserve"> no terminal Maven. Na raiz, execute </w:t>
+      </w:r>
+      <w:r>
+        <w:rPr>
+          <w:rFonts w:ascii="Courier New" w:hAnsi="Courier New"/>
+          <w:sz w:val="19"/>
+        </w:rPr>
         <w:t>podman compose down</w:t>
+      </w:r>
+      <w:r>
+        <w:t xml:space="preserve">, salve os exercícios e confirme </w:t>
+      </w:r>
+      <w:r>
+        <w:rPr>
+          <w:rFonts w:ascii="Courier New" w:hAnsi="Courier New"/>
+          <w:sz w:val="19"/>
+        </w:rPr>
+        <w:t>git status</w:t>
+      </w:r>
+      <w:r>
+        <w:t xml:space="preserve">. Só troque para a aula 2 com o trabalho salvo e sem alterações pendentes. Mantenha os volumes; não use </w:t>
+      </w:r>
+      <w:r>
+        <w:rPr>
+          <w:rFonts w:ascii="Courier New" w:hAnsi="Courier New"/>
+          <w:sz w:val="19"/>
+        </w:rPr>
+        <w:t>down -v</w:t>
+      </w:r>
+      <w:r>
+        <w:t>.</w:t>
+      </w:r>
+    </w:p>
+    <w:p>
+      <w:r>
+        <w:br w:type="page"/>
+      </w:r>
+    </w:p>
+    <w:p>
+      <w:pPr>
+        <w:pStyle w:val="Heading2"/>
+      </w:pPr>
+      <w:r>
+        <w:t>Aula 2 com Maven</w:t>
+      </w:r>
+    </w:p>
+    <w:p>
+      <w:r/>
+      <w:r>
+        <w:rPr>
+          <w:b/>
+        </w:rPr>
+        <w:t>Objetivo:</w:t>
+      </w:r>
+      <w:r>
+        <w:t xml:space="preserve"> gravar ordem e Outbox atomicamente, publicar por relay e aplicar o evento com Inbox e projeção. Distribua os blocos entre contratos, semânticas de entrega e os experimentos executáveis de Outbox/Inbox.</w:t>
+      </w:r>
+    </w:p>
+    <w:p>
+      <w:pPr>
+        <w:pStyle w:val="Heading2"/>
+      </w:pPr>
+      <w:r>
+        <w:t>Iniciar e testar</w:t>
+      </w:r>
+    </w:p>
+    <w:p>
+      <w:r>
+        <w:t>Depois de encerrar a aplicação e a infraestrutura da aula 1 e salvar os exercícios:</w:t>
+      </w:r>
+    </w:p>
+    <w:p>
+      <w:pPr>
+        <w:keepLines/>
+        <w:spacing w:before="20" w:after="120"/>
+        <w:ind w:left="170"/>
+      </w:pPr>
+      <w:r>
+        <w:rPr>
+          <w:rFonts w:ascii="Courier New" w:hAnsi="Courier New"/>
+          <w:sz w:val="18"/>
+        </w:rPr>
+        <w:t>git status</w:t>
+        <w:br/>
+        <w:t>git switch aula-2</w:t>
+        <w:br/>
+        <w:t>podman compose stop aula2</w:t>
+        <w:br/>
+        <w:t>podman compose up -d postgres kafka</w:t>
+        <w:br/>
+        <w:t>podman compose ps</w:t>
+        <w:br/>
+        <w:t>mvn -pl aula2 -am verify</w:t>
+        <w:br/>
+        <w:t>mvn -pl aula2 -am install -DskipTests</w:t>
+        <w:br/>
+        <w:t>mvn -pl aula2 spring-boot:run</w:t>
+      </w:r>
+    </w:p>
+    <w:p>
+      <w:r>
+        <w:t xml:space="preserve">Espere PostgreSQL e Kafka saudáveis antes de iniciar a API. </w:t>
+      </w:r>
+      <w:r>
+        <w:rPr>
+          <w:b/>
+        </w:rPr>
+        <w:t>Esperado:</w:t>
+      </w:r>
+      <w:r>
+        <w:t xml:space="preserve"> 21 testes selecionando domínio + aula 2 e aplicação em </w:t>
+      </w:r>
+      <w:r>
+        <w:rPr>
+          <w:rFonts w:ascii="Courier New" w:hAnsi="Courier New"/>
+          <w:sz w:val="19"/>
+        </w:rPr>
+        <w:t>http://localhost:8082</w:t>
+      </w:r>
+      <w:r>
+        <w:t xml:space="preserve">. Para verificar também a primeira aplicação nesta branch, use </w:t>
+      </w:r>
+      <w:r>
+        <w:rPr>
+          <w:rFonts w:ascii="Courier New" w:hAnsi="Courier New"/>
+          <w:sz w:val="19"/>
+        </w:rPr>
+        <w:t>mvn clean verify</w:t>
+      </w:r>
+      <w:r>
+        <w:t xml:space="preserve">: são </w:t>
+      </w:r>
+      <w:r>
+        <w:rPr>
+          <w:b/>
+        </w:rPr>
+        <w:t>30 testes</w:t>
+      </w:r>
+      <w:r>
+        <w:t xml:space="preserve"> na raiz.</w:t>
+      </w:r>
+    </w:p>
+    <w:p>
+      <w:r>
+        <w:t>Em outro terminal, na mesma raiz:</w:t>
+      </w:r>
+    </w:p>
+    <w:p>
+      <w:pPr>
+        <w:keepLines/>
+        <w:spacing w:before="20" w:after="120"/>
+        <w:ind w:left="170"/>
+      </w:pPr>
+      <w:r>
+        <w:rPr>
+          <w:rFonts w:ascii="Courier New" w:hAnsi="Courier New"/>
+          <w:sz w:val="18"/>
+        </w:rPr>
+        <w:t>python3 scripts/smoke.py --aula 2</w:t>
+      </w:r>
+    </w:p>
+    <w:p>
+      <w:r/>
+      <w:r>
+        <w:rPr>
+          <w:b/>
+        </w:rPr>
+        <w:t>Esperado:</w:t>
+      </w:r>
+      <w:r>
+        <w:t xml:space="preserve"> entrada inválida rejeitada, rollback de ordem + Outbox, relay pausado e retomado, convergência e três reenvios sem duplicar a posição. Execute sem outros alunos usando a mesma instância: o teste de rollback compara contadores globais.</w:t>
+      </w:r>
+    </w:p>
+    <w:p>
+      <w:r>
+        <w:t>Para o bloco de evolução de contratos, em outro terminal:</w:t>
+      </w:r>
+    </w:p>
+    <w:p>
+      <w:pPr>
+        <w:keepLines/>
+        <w:spacing w:before="20" w:after="120"/>
+        <w:ind w:left="170"/>
+      </w:pPr>
+      <w:r>
+        <w:rPr>
+          <w:rFonts w:ascii="Courier New" w:hAnsi="Courier New"/>
+          <w:sz w:val="18"/>
+        </w:rPr>
+        <w:t>podman compose --profile contratos up -d schema-registry</w:t>
+        <w:br/>
+        <w:t>python3 scripts/contratos.py</w:t>
+      </w:r>
+    </w:p>
+    <w:p>
+      <w:r>
+        <w:t xml:space="preserve">Aguarde o registry responder em </w:t>
+      </w:r>
+      <w:r>
+        <w:rPr>
+          <w:rFonts w:ascii="Courier New" w:hAnsi="Courier New"/>
+          <w:sz w:val="19"/>
+        </w:rPr>
+        <w:t>http://localhost:8085</w:t>
+      </w:r>
+      <w:r>
+        <w:t xml:space="preserve"> antes do script. Esse bloco usa o serviço real e não faz parte dos 30 testes Java.</w:t>
+      </w:r>
+    </w:p>
+    <w:p>
+      <w:pPr>
+        <w:pStyle w:val="Heading2"/>
+      </w:pPr>
+      <w:r>
+        <w:t>Sequência de leitura das classes</w:t>
+      </w:r>
+    </w:p>
+    <w:p>
+      <w:r>
+        <w:t xml:space="preserve">1. </w:t>
+      </w:r>
+      <w:r>
+        <w:rPr>
+          <w:b/>
+        </w:rPr>
+        <w:t>Contrato:</w:t>
+      </w:r>
+      <w:r>
+        <w:t xml:space="preserve"> leia </w:t>
+      </w:r>
+      <w:r>
+        <w:rPr>
+          <w:rFonts w:ascii="Courier New" w:hAnsi="Courier New"/>
+          <w:sz w:val="19"/>
+        </w:rPr>
+        <w:t>CloudEvent</w:t>
+      </w:r>
+      <w:r>
+        <w:t xml:space="preserve">, </w:t>
+      </w:r>
+      <w:r>
+        <w:rPr>
+          <w:rFonts w:ascii="Courier New" w:hAnsi="Courier New"/>
+          <w:sz w:val="19"/>
+        </w:rPr>
+        <w:t>OrdemData</w:t>
+      </w:r>
+      <w:r>
+        <w:t xml:space="preserve"> e </w:t>
+      </w:r>
+      <w:r>
+        <w:rPr>
+          <w:rFonts w:ascii="Courier New" w:hAnsi="Courier New"/>
+          <w:sz w:val="19"/>
+        </w:rPr>
+        <w:t>CloudEventTest</w:t>
+      </w:r>
+      <w:r>
+        <w:t xml:space="preserve">. A conversão valida o envelope antes de produzir </w:t>
+      </w:r>
+      <w:r>
+        <w:rPr>
+          <w:rFonts w:ascii="Courier New" w:hAnsi="Courier New"/>
+          <w:sz w:val="19"/>
+        </w:rPr>
+        <w:t>OrderAccepted</w:t>
+      </w:r>
+      <w:r>
+        <w:t>; o contrato externo fica em presenter, não na entidade.</w:t>
+      </w:r>
+    </w:p>
+    <w:p>
+      <w:r>
+        <w:t xml:space="preserve">2. </w:t>
+      </w:r>
+      <w:r>
+        <w:rPr>
+          <w:b/>
+        </w:rPr>
+        <w:t>Criação atômica:</w:t>
+      </w:r>
+      <w:r>
+        <w:t xml:space="preserve"> </w:t>
+      </w:r>
+      <w:r>
+        <w:rPr>
+          <w:rFonts w:ascii="Courier New" w:hAnsi="Courier New"/>
+          <w:sz w:val="19"/>
+        </w:rPr>
+        <w:t>LabController.create</w:t>
+      </w:r>
+      <w:r>
+        <w:t xml:space="preserve"> chama </w:t>
+      </w:r>
+      <w:r>
+        <w:rPr>
+          <w:rFonts w:ascii="Courier New" w:hAnsi="Courier New"/>
+          <w:sz w:val="19"/>
+        </w:rPr>
+        <w:t>CreateOrderUseCase</w:t>
+      </w:r>
+      <w:r>
+        <w:t xml:space="preserve">, que usa </w:t>
+      </w:r>
+      <w:r>
+        <w:rPr>
+          <w:rFonts w:ascii="Courier New" w:hAnsi="Courier New"/>
+          <w:sz w:val="19"/>
+        </w:rPr>
+        <w:t>TransactionBoundary</w:t>
+      </w:r>
+      <w:r>
+        <w:t xml:space="preserve">, </w:t>
+      </w:r>
+      <w:r>
+        <w:rPr>
+          <w:rFonts w:ascii="Courier New" w:hAnsi="Courier New"/>
+          <w:sz w:val="19"/>
+        </w:rPr>
+        <w:t>OrderRepository</w:t>
+      </w:r>
+      <w:r>
+        <w:t xml:space="preserve"> e </w:t>
+      </w:r>
+      <w:r>
+        <w:rPr>
+          <w:rFonts w:ascii="Courier New" w:hAnsi="Courier New"/>
+          <w:sz w:val="19"/>
+        </w:rPr>
+        <w:t>OutboxRepository</w:t>
+      </w:r>
+      <w:r>
+        <w:t xml:space="preserve">. Veja </w:t>
+      </w:r>
+      <w:r>
+        <w:rPr>
+          <w:rFonts w:ascii="Courier New" w:hAnsi="Courier New"/>
+          <w:sz w:val="19"/>
+        </w:rPr>
+        <w:t>SpringTransactionBoundary</w:t>
+      </w:r>
+      <w:r>
+        <w:t xml:space="preserve">, </w:t>
+      </w:r>
+      <w:r>
+        <w:rPr>
+          <w:rFonts w:ascii="Courier New" w:hAnsi="Courier New"/>
+          <w:sz w:val="19"/>
+        </w:rPr>
+        <w:t>JdbcOrderRepository</w:t>
+      </w:r>
+      <w:r>
+        <w:t xml:space="preserve"> e </w:t>
+      </w:r>
+      <w:r>
+        <w:rPr>
+          <w:rFonts w:ascii="Courier New" w:hAnsi="Courier New"/>
+          <w:sz w:val="19"/>
+        </w:rPr>
+        <w:t>JdbcOutboxRepository</w:t>
+      </w:r>
+      <w:r>
+        <w:t xml:space="preserve"> para o commit SQL real. </w:t>
+      </w:r>
+      <w:r>
+        <w:rPr>
+          <w:rFonts w:ascii="Courier New" w:hAnsi="Courier New"/>
+          <w:sz w:val="19"/>
+        </w:rPr>
+        <w:t>LabPresenter.created</w:t>
+      </w:r>
+      <w:r>
+        <w:t xml:space="preserve"> prepara a resposta CloudEvents.</w:t>
+      </w:r>
+    </w:p>
+    <w:p>
+      <w:r>
+        <w:t xml:space="preserve">3. </w:t>
+      </w:r>
+      <w:r>
+        <w:rPr>
+          <w:b/>
+        </w:rPr>
+        <w:t>Relay:</w:t>
+      </w:r>
+      <w:r>
+        <w:t xml:space="preserve"> </w:t>
+      </w:r>
+      <w:r>
+        <w:rPr>
+          <w:rFonts w:ascii="Courier New" w:hAnsi="Courier New"/>
+          <w:sz w:val="19"/>
+        </w:rPr>
+        <w:t>OutboxScheduler</w:t>
+      </w:r>
+      <w:r>
+        <w:t xml:space="preserve"> chama </w:t>
+      </w:r>
+      <w:r>
+        <w:rPr>
+          <w:rFonts w:ascii="Courier New" w:hAnsi="Courier New"/>
+          <w:sz w:val="19"/>
+        </w:rPr>
+        <w:t>PublishPendingEventsUseCase</w:t>
+      </w:r>
+      <w:r>
+        <w:t xml:space="preserve">, que consulta </w:t>
+      </w:r>
+      <w:r>
+        <w:rPr>
+          <w:rFonts w:ascii="Courier New" w:hAnsi="Courier New"/>
+          <w:sz w:val="19"/>
+        </w:rPr>
+        <w:t>RelayControl</w:t>
+      </w:r>
+      <w:r>
+        <w:t xml:space="preserve">, bloqueia pendentes e publica por </w:t>
+      </w:r>
+      <w:r>
+        <w:rPr>
+          <w:rFonts w:ascii="Courier New" w:hAnsi="Courier New"/>
+          <w:sz w:val="19"/>
+        </w:rPr>
+        <w:t>OrderEventPublisher</w:t>
+      </w:r>
+      <w:r>
+        <w:t xml:space="preserve">. </w:t>
+      </w:r>
+      <w:r>
+        <w:rPr>
+          <w:rFonts w:ascii="Courier New" w:hAnsi="Courier New"/>
+          <w:sz w:val="19"/>
+        </w:rPr>
+        <w:t>KafkaOrderEventPublisher</w:t>
+      </w:r>
+      <w:r>
+        <w:t xml:space="preserve"> aguarda o ack antes da marcação na Outbox; uma falha antes do commit ainda permite reentrega.</w:t>
+      </w:r>
+    </w:p>
+    <w:p>
+      <w:r>
+        <w:t xml:space="preserve">4. </w:t>
+      </w:r>
+      <w:r>
+        <w:rPr>
+          <w:b/>
+        </w:rPr>
+        <w:t>Inbox e projeção:</w:t>
+      </w:r>
+      <w:r>
+        <w:t xml:space="preserve"> </w:t>
+      </w:r>
+      <w:r>
+        <w:rPr>
+          <w:rFonts w:ascii="Courier New" w:hAnsi="Courier New"/>
+          <w:sz w:val="19"/>
+        </w:rPr>
+        <w:t>PositionConsumer</w:t>
+      </w:r>
+      <w:r>
+        <w:t xml:space="preserve"> converte o evento e chama </w:t>
+      </w:r>
+      <w:r>
+        <w:rPr>
+          <w:rFonts w:ascii="Courier New" w:hAnsi="Courier New"/>
+          <w:sz w:val="19"/>
+        </w:rPr>
+        <w:t>ApplyOrderAcceptedUseCase</w:t>
+      </w:r>
+      <w:r>
+        <w:t xml:space="preserve">. </w:t>
+      </w:r>
+      <w:r>
+        <w:rPr>
+          <w:rFonts w:ascii="Courier New" w:hAnsi="Courier New"/>
+          <w:sz w:val="19"/>
+        </w:rPr>
+        <w:t>InboxRepository</w:t>
+      </w:r>
+      <w:r>
+        <w:t xml:space="preserve"> e </w:t>
+      </w:r>
+      <w:r>
+        <w:rPr>
+          <w:rFonts w:ascii="Courier New" w:hAnsi="Courier New"/>
+          <w:sz w:val="19"/>
+        </w:rPr>
+        <w:t>PositionRepository</w:t>
+      </w:r>
+      <w:r>
+        <w:t>, implementadas pelos adaptadores JDBC, registram a identidade e alteram a posição na mesma transação.</w:t>
+      </w:r>
+    </w:p>
+    <w:p>
+      <w:r>
+        <w:t xml:space="preserve">5. </w:t>
+      </w:r>
+      <w:r>
+        <w:rPr>
+          <w:b/>
+        </w:rPr>
+        <w:t>Consulta e reenvio:</w:t>
+      </w:r>
+      <w:r>
+        <w:t xml:space="preserve"> </w:t>
+      </w:r>
+      <w:r>
+        <w:rPr>
+          <w:rFonts w:ascii="Courier New" w:hAnsi="Courier New"/>
+          <w:sz w:val="19"/>
+        </w:rPr>
+        <w:t>QueryLabUseCase</w:t>
+      </w:r>
+      <w:r>
+        <w:t xml:space="preserve"> usa </w:t>
+      </w:r>
+      <w:r>
+        <w:rPr>
+          <w:rFonts w:ascii="Courier New" w:hAnsi="Courier New"/>
+          <w:sz w:val="19"/>
+        </w:rPr>
+        <w:t>LabReadRepository</w:t>
+      </w:r>
+      <w:r>
+        <w:t xml:space="preserve"> e </w:t>
+      </w:r>
+      <w:r>
+        <w:rPr>
+          <w:rFonts w:ascii="Courier New" w:hAnsi="Courier New"/>
+          <w:sz w:val="19"/>
+        </w:rPr>
+        <w:t>ReadModels</w:t>
+      </w:r>
+      <w:r>
+        <w:t xml:space="preserve">; </w:t>
+      </w:r>
+      <w:r>
+        <w:rPr>
+          <w:rFonts w:ascii="Courier New" w:hAnsi="Courier New"/>
+          <w:sz w:val="19"/>
+        </w:rPr>
+        <w:t>LabPresenter</w:t>
+      </w:r>
+      <w:r>
+        <w:t xml:space="preserve"> traduz os resultados para JSON. </w:t>
+      </w:r>
+      <w:r>
+        <w:rPr>
+          <w:rFonts w:ascii="Courier New" w:hAnsi="Courier New"/>
+          <w:sz w:val="19"/>
+        </w:rPr>
+        <w:t>RequeueEventUseCase</w:t>
+      </w:r>
+      <w:r>
+        <w:t xml:space="preserve"> recoloca o mesmo ID como pendente. O presenter não consulta o banco nem executa os casos de uso.</w:t>
+      </w:r>
+    </w:p>
+    <w:p>
+      <w:r>
+        <w:t xml:space="preserve">6. </w:t>
+      </w:r>
+      <w:r>
+        <w:rPr>
+          <w:b/>
+        </w:rPr>
+        <w:t>Composição e testes:</w:t>
+      </w:r>
+      <w:r>
+        <w:t xml:space="preserve"> termine com </w:t>
+      </w:r>
+      <w:r>
+        <w:rPr>
+          <w:rFonts w:ascii="Courier New" w:hAnsi="Courier New"/>
+          <w:sz w:val="19"/>
+        </w:rPr>
+        <w:t>UseCaseConfiguration</w:t>
+      </w:r>
+      <w:r>
+        <w:t xml:space="preserve">, </w:t>
+      </w:r>
+      <w:r>
+        <w:rPr>
+          <w:rFonts w:ascii="Courier New" w:hAnsi="Courier New"/>
+          <w:sz w:val="19"/>
+        </w:rPr>
+        <w:t>KafkaConfiguration</w:t>
+      </w:r>
+      <w:r>
+        <w:t xml:space="preserve">, </w:t>
+      </w:r>
+      <w:r>
+        <w:rPr>
+          <w:rFonts w:ascii="Courier New" w:hAnsi="Courier New"/>
+          <w:sz w:val="19"/>
+        </w:rPr>
+        <w:t>OrderUseCasesTest</w:t>
+      </w:r>
+      <w:r>
+        <w:t xml:space="preserve">, </w:t>
+      </w:r>
+      <w:r>
+        <w:rPr>
+          <w:rFonts w:ascii="Courier New" w:hAnsi="Courier New"/>
+          <w:sz w:val="19"/>
+        </w:rPr>
+        <w:t>HttpContractTest</w:t>
+      </w:r>
+      <w:r>
+        <w:t xml:space="preserve"> e </w:t>
+      </w:r>
+      <w:r>
+        <w:rPr>
+          <w:rFonts w:ascii="Courier New" w:hAnsi="Courier New"/>
+          <w:sz w:val="19"/>
+        </w:rPr>
+        <w:t>ArchitectureTest</w:t>
+      </w:r>
+      <w:r>
+        <w:t>. Diferencie os testes sem serviços externos do smoke com banco e brokers reais.</w:t>
+      </w:r>
+    </w:p>
+    <w:p>
+      <w:pPr>
+        <w:pStyle w:val="Heading2"/>
+      </w:pPr>
+      <w:r>
+        <w:t>Encerrar e consultar os detalhes</w:t>
+      </w:r>
+    </w:p>
+    <w:p>
+      <w:r>
+        <w:t xml:space="preserve">Encerre o Maven com </w:t>
+      </w:r>
+      <w:r>
+        <w:rPr>
+          <w:b/>
+        </w:rPr>
+        <w:t>Ctrl+C</w:t>
+      </w:r>
+      <w:r>
+        <w:t xml:space="preserve"> e execute </w:t>
+      </w:r>
+      <w:r>
+        <w:rPr>
+          <w:rFonts w:ascii="Courier New" w:hAnsi="Courier New"/>
+          <w:sz w:val="19"/>
+        </w:rPr>
+        <w:t>podman compose --profile contratos down</w:t>
+      </w:r>
+      <w:r>
+        <w:t xml:space="preserve"> na raiz. Os volumes permanecem. Não execute a mesma API pelo Maven e no container ao mesmo tempo.</w:t>
       </w:r>
     </w:p>
     <w:sectPr>

</xml_diff>